<commit_message>
analysis on more datasets
</commit_message>
<xml_diff>
--- a/paper/submission_tables/Table2.docx
+++ b/paper/submission_tables/Table2.docx
@@ -13,7 +13,7 @@
         <w:t xml:space="preserve"> </w:t>
       </w:r>
       <w:r>
-        <w:t xml:space="preserve">within-family rank instability on the Klaeger dataset (</w:t>
+        <w:t xml:space="preserve">within-family rank instability, on the Klaeger (</w:t>
       </w:r>
       <m:oMath>
         <m:r>
@@ -33,7 +33,91 @@
         <w:t xml:space="preserve"> </w:t>
       </w:r>
       <w:r>
-        <w:t xml:space="preserve">active drugs). Significance: *</w:t>
+        <w:t xml:space="preserve">active drugs)</w:t>
+      </w:r>
+      <w:r>
+        <w:t xml:space="preserve"> </w:t>
+      </w:r>
+      <w:r>
+        <w:t xml:space="preserve">and Davis (</w:t>
+      </w:r>
+      <m:oMath>
+        <m:r>
+          <m:t>n</m:t>
+        </m:r>
+        <m:r>
+          <m:rPr>
+            <m:sty m:val="p"/>
+          </m:rPr>
+          <m:t>=</m:t>
+        </m:r>
+        <m:r>
+          <m:t>68</m:t>
+        </m:r>
+      </m:oMath>
+      <w:r>
+        <w:t xml:space="preserve">) datasets. Columns are the S-score (S), entropy (E),</w:t>
+      </w:r>
+      <w:r>
+        <w:t xml:space="preserve"> </w:t>
+      </w:r>
+      <w:r>
+        <w:t xml:space="preserve">Gini (G), and ratio (R) families. The ratio family’s dependence on the</w:t>
+      </w:r>
+      <w:r>
+        <w:t xml:space="preserve"> </w:t>
+      </w:r>
+      <w:r>
+        <w:t xml:space="preserve">top</w:t>
+      </w:r>
+      <m:oMath>
+        <m:sSub>
+          <m:e>
+            <m:r>
+              <m:t>​</m:t>
+            </m:r>
+          </m:e>
+          <m:sub>
+            <m:r>
+              <m:t>1</m:t>
+            </m:r>
+          </m:sub>
+        </m:sSub>
+      </m:oMath>
+      <w:r>
+        <w:t xml:space="preserve">–top</w:t>
+      </w:r>
+      <m:oMath>
+        <m:sSub>
+          <m:e>
+            <m:r>
+              <m:t>​</m:t>
+            </m:r>
+          </m:e>
+          <m:sub>
+            <m:r>
+              <m:t>2</m:t>
+            </m:r>
+          </m:sub>
+        </m:sSub>
+      </m:oMath>
+      <w:r>
+        <w:t xml:space="preserve"> </w:t>
+      </w:r>
+      <w:r>
+        <w:t xml:space="preserve">gap replicates strongly on both datasets; the</w:t>
+      </w:r>
+      <w:r>
+        <w:t xml:space="preserve"> </w:t>
+      </w:r>
+      <w:r>
+        <w:t xml:space="preserve">S-score’s dependence on the active-affinity spread does not (no feature</w:t>
+      </w:r>
+      <w:r>
+        <w:t xml:space="preserve"> </w:t>
+      </w:r>
+      <w:r>
+        <w:t xml:space="preserve">is significant on Davis). Significance: *</w:t>
       </w:r>
       <w:r>
         <w:t xml:space="preserve"> </w:t>
@@ -73,7 +157,13 @@
         </m:r>
       </m:oMath>
       <w:r>
-        <w:t xml:space="preserve">, ***</w:t>
+        <w:t xml:space="preserve">,</w:t>
+      </w:r>
+      <w:r>
+        <w:t xml:space="preserve"> </w:t>
+      </w:r>
+      <w:r>
+        <w:t xml:space="preserve">***</w:t>
       </w:r>
       <w:r>
         <w:t xml:space="preserve"> </w:t>
@@ -100,20 +190,93 @@
       <w:tblPr>
         <w:tblStyle w:val="Table"/>
         <w:tblW w:type="auto" w:w="0"/>
-        <w:tblLook w:firstRow="1" w:lastRow="0" w:firstColumn="0" w:lastColumn="0" w:noHBand="0" w:noVBand="0" w:val="0020"/>
-        <w:tblCaption w:val="Table 2. Spearman correlations between binding profile features and within-family rank instability on the Klaeger dataset (n=206 active drugs). Significance: * p&lt;0.05, ** p&lt;0.01, *** p&lt;0.001."/>
+        <w:tblLook w:firstRow="0" w:lastRow="0" w:firstColumn="0" w:lastColumn="0" w:noHBand="0" w:noVBand="0" w:val="0000"/>
+        <w:tblCaption w:val="Table 2. Spearman correlations between binding profile features and within-family rank instability, on the Klaeger (n=206 active drugs) and Davis (n=68) datasets. Columns are the S-score (S), entropy (E), Gini (G), and ratio (R) families. The ratio family’s dependence on the top_1–top_2 gap replicates strongly on both datasets; the S-score’s dependence on the active-affinity spread does not (no feature is significant on Davis). Significance: * p&lt;0.05, ** p&lt;0.01, *** p&lt;0.001."/>
       </w:tblPr>
       <w:tblGrid>
-        <w:gridCol w:w="1584"/>
-        <w:gridCol w:w="1584"/>
-        <w:gridCol w:w="1584"/>
-        <w:gridCol w:w="1584"/>
-        <w:gridCol w:w="1584"/>
+        <w:gridCol w:w="880"/>
+        <w:gridCol w:w="880"/>
+        <w:gridCol w:w="880"/>
+        <w:gridCol w:w="880"/>
+        <w:gridCol w:w="880"/>
+        <w:gridCol w:w="880"/>
+        <w:gridCol w:w="880"/>
+        <w:gridCol w:w="880"/>
+        <w:gridCol w:w="880"/>
       </w:tblGrid>
       <w:tr>
-        <w:trPr>
-          <w:tblHeader w:val="on"/>
-        </w:trPr>
+        <w:tc>
+          <w:tcPr/>
+          <w:p>
+            <w:pPr>
+              <w:pStyle w:val="Compact"/>
+            </w:pPr>
+          </w:p>
+        </w:tc>
+        <w:tc>
+          <w:tcPr>
+            <w:gridSpan w:val="4"/>
+          </w:tcPr>
+          <w:p>
+            <w:pPr>
+              <w:pStyle w:val="Compact"/>
+              <w:jc w:val="center"/>
+            </w:pPr>
+            <w:r>
+              <w:t xml:space="preserve">Klaeger (</w:t>
+            </w:r>
+            <m:oMath>
+              <m:r>
+                <m:t>n</m:t>
+              </m:r>
+              <m:r>
+                <m:rPr>
+                  <m:sty m:val="p"/>
+                </m:rPr>
+                <m:t>=</m:t>
+              </m:r>
+              <m:r>
+                <m:t>206</m:t>
+              </m:r>
+            </m:oMath>
+            <w:r>
+              <w:t xml:space="preserve">)</w:t>
+            </w:r>
+          </w:p>
+        </w:tc>
+        <w:tc>
+          <w:tcPr>
+            <w:gridSpan w:val="4"/>
+          </w:tcPr>
+          <w:p>
+            <w:pPr>
+              <w:pStyle w:val="Compact"/>
+              <w:jc w:val="center"/>
+            </w:pPr>
+            <w:r>
+              <w:t xml:space="preserve">Davis (</w:t>
+            </w:r>
+            <m:oMath>
+              <m:r>
+                <m:t>n</m:t>
+              </m:r>
+              <m:r>
+                <m:rPr>
+                  <m:sty m:val="p"/>
+                </m:rPr>
+                <m:t>=</m:t>
+              </m:r>
+              <m:r>
+                <m:t>68</m:t>
+              </m:r>
+            </m:oMath>
+            <w:r>
+              <w:t xml:space="preserve">)</w:t>
+            </w:r>
+          </w:p>
+        </w:tc>
+      </w:tr>
+      <w:tr>
         <w:tc>
           <w:tcPr/>
           <w:p>
@@ -134,7 +297,7 @@
               <w:jc w:val="center"/>
             </w:pPr>
             <w:r>
-              <w:t xml:space="preserve">S-score</w:t>
+              <w:t xml:space="preserve">S</w:t>
             </w:r>
           </w:p>
         </w:tc>
@@ -146,7 +309,7 @@
               <w:jc w:val="center"/>
             </w:pPr>
             <w:r>
-              <w:t xml:space="preserve">Entropy</w:t>
+              <w:t xml:space="preserve">E</w:t>
             </w:r>
           </w:p>
         </w:tc>
@@ -158,7 +321,7 @@
               <w:jc w:val="center"/>
             </w:pPr>
             <w:r>
-              <w:t xml:space="preserve">Gini</w:t>
+              <w:t xml:space="preserve">G</w:t>
             </w:r>
           </w:p>
         </w:tc>
@@ -170,7 +333,55 @@
               <w:jc w:val="center"/>
             </w:pPr>
             <w:r>
-              <w:t xml:space="preserve">Ratio</w:t>
+              <w:t xml:space="preserve">R</w:t>
+            </w:r>
+          </w:p>
+        </w:tc>
+        <w:tc>
+          <w:tcPr/>
+          <w:p>
+            <w:pPr>
+              <w:pStyle w:val="Compact"/>
+              <w:jc w:val="center"/>
+            </w:pPr>
+            <w:r>
+              <w:t xml:space="preserve">S</w:t>
+            </w:r>
+          </w:p>
+        </w:tc>
+        <w:tc>
+          <w:tcPr/>
+          <w:p>
+            <w:pPr>
+              <w:pStyle w:val="Compact"/>
+              <w:jc w:val="center"/>
+            </w:pPr>
+            <w:r>
+              <w:t xml:space="preserve">E</w:t>
+            </w:r>
+          </w:p>
+        </w:tc>
+        <w:tc>
+          <w:tcPr/>
+          <w:p>
+            <w:pPr>
+              <w:pStyle w:val="Compact"/>
+              <w:jc w:val="center"/>
+            </w:pPr>
+            <w:r>
+              <w:t xml:space="preserve">G</w:t>
+            </w:r>
+          </w:p>
+        </w:tc>
+        <w:tc>
+          <w:tcPr/>
+          <w:p>
+            <w:pPr>
+              <w:pStyle w:val="Compact"/>
+              <w:jc w:val="center"/>
+            </w:pPr>
+            <w:r>
+              <w:t xml:space="preserve">R</w:t>
             </w:r>
           </w:p>
         </w:tc>
@@ -369,6 +580,122 @@
               <m:r>
                 <m:t>0.040</m:t>
               </m:r>
+            </m:oMath>
+          </w:p>
+        </w:tc>
+        <w:tc>
+          <w:tcPr/>
+          <w:p>
+            <w:pPr>
+              <w:pStyle w:val="Compact"/>
+              <w:jc w:val="center"/>
+            </w:pPr>
+            <m:oMath>
+              <m:r>
+                <m:rPr>
+                  <m:sty m:val="p"/>
+                </m:rPr>
+                <m:t>−</m:t>
+              </m:r>
+              <m:r>
+                <m:t>0.150</m:t>
+              </m:r>
+            </m:oMath>
+          </w:p>
+        </w:tc>
+        <w:tc>
+          <w:tcPr/>
+          <w:p>
+            <w:pPr>
+              <w:pStyle w:val="Compact"/>
+              <w:jc w:val="center"/>
+            </w:pPr>
+            <m:oMath>
+              <m:r>
+                <m:rPr>
+                  <m:sty m:val="p"/>
+                </m:rPr>
+                <m:t>−</m:t>
+              </m:r>
+              <m:sSup>
+                <m:e>
+                  <m:r>
+                    <m:t>0.279</m:t>
+                  </m:r>
+                </m:e>
+                <m:sup>
+                  <m:r>
+                    <m:rPr>
+                      <m:sty m:val="p"/>
+                    </m:rPr>
+                    <m:t>*</m:t>
+                  </m:r>
+                </m:sup>
+              </m:sSup>
+            </m:oMath>
+          </w:p>
+        </w:tc>
+        <w:tc>
+          <w:tcPr/>
+          <w:p>
+            <w:pPr>
+              <w:pStyle w:val="Compact"/>
+              <w:jc w:val="center"/>
+            </w:pPr>
+            <m:oMath>
+              <m:r>
+                <m:rPr>
+                  <m:sty m:val="p"/>
+                </m:rPr>
+                <m:t>−</m:t>
+              </m:r>
+              <m:sSup>
+                <m:e>
+                  <m:r>
+                    <m:t>0.299</m:t>
+                  </m:r>
+                </m:e>
+                <m:sup>
+                  <m:r>
+                    <m:rPr>
+                      <m:sty m:val="p"/>
+                    </m:rPr>
+                    <m:t>*</m:t>
+                  </m:r>
+                </m:sup>
+              </m:sSup>
+            </m:oMath>
+          </w:p>
+        </w:tc>
+        <w:tc>
+          <w:tcPr/>
+          <w:p>
+            <w:pPr>
+              <w:pStyle w:val="Compact"/>
+              <w:jc w:val="center"/>
+            </w:pPr>
+            <m:oMath>
+              <m:r>
+                <m:rPr>
+                  <m:sty m:val="p"/>
+                </m:rPr>
+                <m:t>+</m:t>
+              </m:r>
+              <m:sSup>
+                <m:e>
+                  <m:r>
+                    <m:t>0.294</m:t>
+                  </m:r>
+                </m:e>
+                <m:sup>
+                  <m:r>
+                    <m:rPr>
+                      <m:sty m:val="p"/>
+                    </m:rPr>
+                    <m:t>*</m:t>
+                  </m:r>
+                </m:sup>
+              </m:sSup>
             </m:oMath>
           </w:p>
         </w:tc>
@@ -527,6 +854,110 @@
             </m:oMath>
           </w:p>
         </w:tc>
+        <w:tc>
+          <w:tcPr/>
+          <w:p>
+            <w:pPr>
+              <w:pStyle w:val="Compact"/>
+              <w:jc w:val="center"/>
+            </w:pPr>
+            <m:oMath>
+              <m:r>
+                <m:rPr>
+                  <m:sty m:val="p"/>
+                </m:rPr>
+                <m:t>−</m:t>
+              </m:r>
+              <m:r>
+                <m:t>0.096</m:t>
+              </m:r>
+            </m:oMath>
+          </w:p>
+        </w:tc>
+        <w:tc>
+          <w:tcPr/>
+          <w:p>
+            <w:pPr>
+              <w:pStyle w:val="Compact"/>
+              <w:jc w:val="center"/>
+            </w:pPr>
+            <m:oMath>
+              <m:r>
+                <m:rPr>
+                  <m:sty m:val="p"/>
+                </m:rPr>
+                <m:t>−</m:t>
+              </m:r>
+              <m:r>
+                <m:t>0.007</m:t>
+              </m:r>
+            </m:oMath>
+          </w:p>
+        </w:tc>
+        <w:tc>
+          <w:tcPr/>
+          <w:p>
+            <w:pPr>
+              <w:pStyle w:val="Compact"/>
+              <w:jc w:val="center"/>
+            </w:pPr>
+            <m:oMath>
+              <m:r>
+                <m:rPr>
+                  <m:sty m:val="p"/>
+                </m:rPr>
+                <m:t>−</m:t>
+              </m:r>
+              <m:r>
+                <m:t>0.029</m:t>
+              </m:r>
+            </m:oMath>
+          </w:p>
+        </w:tc>
+        <w:tc>
+          <w:tcPr/>
+          <w:p>
+            <w:pPr>
+              <w:pStyle w:val="Compact"/>
+              <w:jc w:val="center"/>
+            </w:pPr>
+            <m:oMath>
+              <m:r>
+                <m:rPr>
+                  <m:sty m:val="p"/>
+                </m:rPr>
+                <m:t>−</m:t>
+              </m:r>
+              <m:sSup>
+                <m:e>
+                  <m:r>
+                    <m:t>0.446</m:t>
+                  </m:r>
+                </m:e>
+                <m:sup>
+                  <m:r>
+                    <m:rPr>
+                      <m:sty m:val="p"/>
+                    </m:rPr>
+                    <m:t>*</m:t>
+                  </m:r>
+                  <m:r>
+                    <m:rPr>
+                      <m:sty m:val="p"/>
+                    </m:rPr>
+                    <m:t>*</m:t>
+                  </m:r>
+                  <m:r>
+                    <m:rPr>
+                      <m:sty m:val="p"/>
+                    </m:rPr>
+                    <m:t>*</m:t>
+                  </m:r>
+                </m:sup>
+              </m:sSup>
+            </m:oMath>
+          </w:p>
+        </w:tc>
       </w:tr>
       <w:tr>
         <w:tc>
@@ -675,6 +1106,86 @@
             </m:oMath>
           </w:p>
         </w:tc>
+        <w:tc>
+          <w:tcPr/>
+          <w:p>
+            <w:pPr>
+              <w:pStyle w:val="Compact"/>
+              <w:jc w:val="center"/>
+            </w:pPr>
+            <m:oMath>
+              <m:r>
+                <m:rPr>
+                  <m:sty m:val="p"/>
+                </m:rPr>
+                <m:t>−</m:t>
+              </m:r>
+              <m:r>
+                <m:t>0.003</m:t>
+              </m:r>
+            </m:oMath>
+          </w:p>
+        </w:tc>
+        <w:tc>
+          <w:tcPr/>
+          <w:p>
+            <w:pPr>
+              <w:pStyle w:val="Compact"/>
+              <w:jc w:val="center"/>
+            </w:pPr>
+            <m:oMath>
+              <m:r>
+                <m:rPr>
+                  <m:sty m:val="p"/>
+                </m:rPr>
+                <m:t>−</m:t>
+              </m:r>
+              <m:r>
+                <m:t>0.015</m:t>
+              </m:r>
+            </m:oMath>
+          </w:p>
+        </w:tc>
+        <w:tc>
+          <w:tcPr/>
+          <w:p>
+            <w:pPr>
+              <w:pStyle w:val="Compact"/>
+              <w:jc w:val="center"/>
+            </w:pPr>
+            <m:oMath>
+              <m:r>
+                <m:rPr>
+                  <m:sty m:val="p"/>
+                </m:rPr>
+                <m:t>+</m:t>
+              </m:r>
+              <m:r>
+                <m:t>0.005</m:t>
+              </m:r>
+            </m:oMath>
+          </w:p>
+        </w:tc>
+        <w:tc>
+          <w:tcPr/>
+          <w:p>
+            <w:pPr>
+              <w:pStyle w:val="Compact"/>
+              <w:jc w:val="center"/>
+            </w:pPr>
+            <m:oMath>
+              <m:r>
+                <m:rPr>
+                  <m:sty m:val="p"/>
+                </m:rPr>
+                <m:t>+</m:t>
+              </m:r>
+              <m:r>
+                <m:t>0.042</m:t>
+              </m:r>
+            </m:oMath>
+          </w:p>
+        </w:tc>
       </w:tr>
       <w:tr>
         <w:tc>
@@ -829,6 +1340,86 @@
             </m:oMath>
           </w:p>
         </w:tc>
+        <w:tc>
+          <w:tcPr/>
+          <w:p>
+            <w:pPr>
+              <w:pStyle w:val="Compact"/>
+              <w:jc w:val="center"/>
+            </w:pPr>
+            <m:oMath>
+              <m:r>
+                <m:rPr>
+                  <m:sty m:val="p"/>
+                </m:rPr>
+                <m:t>+</m:t>
+              </m:r>
+              <m:r>
+                <m:t>0.003</m:t>
+              </m:r>
+            </m:oMath>
+          </w:p>
+        </w:tc>
+        <w:tc>
+          <w:tcPr/>
+          <w:p>
+            <w:pPr>
+              <w:pStyle w:val="Compact"/>
+              <w:jc w:val="center"/>
+            </w:pPr>
+            <m:oMath>
+              <m:r>
+                <m:rPr>
+                  <m:sty m:val="p"/>
+                </m:rPr>
+                <m:t>−</m:t>
+              </m:r>
+              <m:r>
+                <m:t>0.111</m:t>
+              </m:r>
+            </m:oMath>
+          </w:p>
+        </w:tc>
+        <w:tc>
+          <w:tcPr/>
+          <w:p>
+            <w:pPr>
+              <w:pStyle w:val="Compact"/>
+              <w:jc w:val="center"/>
+            </w:pPr>
+            <m:oMath>
+              <m:r>
+                <m:rPr>
+                  <m:sty m:val="p"/>
+                </m:rPr>
+                <m:t>−</m:t>
+              </m:r>
+              <m:r>
+                <m:t>0.098</m:t>
+              </m:r>
+            </m:oMath>
+          </w:p>
+        </w:tc>
+        <w:tc>
+          <w:tcPr/>
+          <w:p>
+            <w:pPr>
+              <w:pStyle w:val="Compact"/>
+              <w:jc w:val="center"/>
+            </w:pPr>
+            <m:oMath>
+              <m:r>
+                <m:rPr>
+                  <m:sty m:val="p"/>
+                </m:rPr>
+                <m:t>+</m:t>
+              </m:r>
+              <m:r>
+                <m:t>0.136</m:t>
+              </m:r>
+            </m:oMath>
+          </w:p>
+        </w:tc>
       </w:tr>
       <w:tr>
         <w:tc>
@@ -1039,6 +1630,98 @@
                     </m:rPr>
                     <m:t>*</m:t>
                   </m:r>
+                  <m:r>
+                    <m:rPr>
+                      <m:sty m:val="p"/>
+                    </m:rPr>
+                    <m:t>*</m:t>
+                  </m:r>
+                </m:sup>
+              </m:sSup>
+            </m:oMath>
+          </w:p>
+        </w:tc>
+        <w:tc>
+          <w:tcPr/>
+          <w:p>
+            <w:pPr>
+              <w:pStyle w:val="Compact"/>
+              <w:jc w:val="center"/>
+            </w:pPr>
+            <m:oMath>
+              <m:r>
+                <m:rPr>
+                  <m:sty m:val="p"/>
+                </m:rPr>
+                <m:t>−</m:t>
+              </m:r>
+              <m:r>
+                <m:t>0.055</m:t>
+              </m:r>
+            </m:oMath>
+          </w:p>
+        </w:tc>
+        <w:tc>
+          <w:tcPr/>
+          <w:p>
+            <w:pPr>
+              <w:pStyle w:val="Compact"/>
+              <w:jc w:val="center"/>
+            </w:pPr>
+            <m:oMath>
+              <m:r>
+                <m:rPr>
+                  <m:sty m:val="p"/>
+                </m:rPr>
+                <m:t>−</m:t>
+              </m:r>
+              <m:r>
+                <m:t>0.203</m:t>
+              </m:r>
+            </m:oMath>
+          </w:p>
+        </w:tc>
+        <w:tc>
+          <w:tcPr/>
+          <w:p>
+            <w:pPr>
+              <w:pStyle w:val="Compact"/>
+              <w:jc w:val="center"/>
+            </w:pPr>
+            <m:oMath>
+              <m:r>
+                <m:rPr>
+                  <m:sty m:val="p"/>
+                </m:rPr>
+                <m:t>−</m:t>
+              </m:r>
+              <m:r>
+                <m:t>0.187</m:t>
+              </m:r>
+            </m:oMath>
+          </w:p>
+        </w:tc>
+        <w:tc>
+          <w:tcPr/>
+          <w:p>
+            <w:pPr>
+              <w:pStyle w:val="Compact"/>
+              <w:jc w:val="center"/>
+            </w:pPr>
+            <m:oMath>
+              <m:r>
+                <m:rPr>
+                  <m:sty m:val="p"/>
+                </m:rPr>
+                <m:t>+</m:t>
+              </m:r>
+              <m:sSup>
+                <m:e>
+                  <m:r>
+                    <m:t>0.298</m:t>
+                  </m:r>
+                </m:e>
+                <m:sup>
                   <m:r>
                     <m:rPr>
                       <m:sty m:val="p"/>

</xml_diff>